<commit_message>
Redesign learning dashboard with Ask Me, improve AI Tutor engine, fix downloads, and refine learning workflow
</commit_message>
<xml_diff>
--- a/static/downloads/Frank Esogwa_Active Voice and Passive Voice.pdf_AI_Study_Notes.docx
+++ b/static/downloads/Frank Esogwa_Active Voice and Passive Voice.pdf_AI_Study_Notes.docx
@@ -91,101 +91,97 @@
     </w:p>
     <w:p>
       <w:r>
-        <w:t>Let’s work through active and passive voice together—it’s one of those topics that really opens up how you write and understand sentences.</w:t>
+        <w:t>Let’s work through the idea of active and passive voice together. At first, it might feel like a lot, but really, it comes down to a simple question: Who is doing the action? When you understand that, everything clicks.</w:t>
         <w:br/>
         <w:br/>
-        <w:t>### 💡 The Big Idea: Active vs. Passive Voice</w:t>
+        <w:t>### 💡 The Big Idea: Who's Doing What?</w:t>
         <w:br/>
         <w:br/>
-        <w:t>In **active voice**, the subject of the sentence is the one doing the action. Imagine it like this: The person or thing starts the action. For example, in "The teacher explained the lesson," the teacher is doing the explaining.</w:t>
+        <w:t>In **active voice**, the subject is doing the action. Imagine you’re telling a story about yourself—you're the star who’s doing things. For example, “The chef cooked the meal.” The chef (subject) is doing the cooking (verb) to the meal (object).</w:t>
         <w:br/>
         <w:br/>
-        <w:t>In **passive voice**, the subject of the sentence is *receiving* the action. It’s like the person or thing is on the receiving end. So, "The lesson was explained by the teacher" puts the lesson first—it’s the one that feels the action.</w:t>
+        <w:t>In **passive voice**, the subject is receiving the action. It’s like being the person watching something happen to you. For example, “The meal was cooked by the chef.” Now, the meal is the focus because that’s what the sentence is about, and the chef’s action is mentioned after.</w:t>
         <w:br/>
         <w:br/>
-        <w:t>Don’t worry if this feels a little confusing—it’s totally normal at first. With a couple of examples, you’ll see the clear difference.</w:t>
+        <w:t>Don’t worry if passive voice sounds strange—it’s just flipping who we pay attention to in the sentence.</w:t>
         <w:br/>
         <w:br/>
-        <w:t>### 🌍 Make it Feel Real: Think of a Game</w:t>
+        <w:t>### 🌍 Let's Make It Real</w:t>
         <w:br/>
         <w:br/>
-        <w:t xml:space="preserve">Imagine a soccer match. </w:t>
-        <w:br/>
-        <w:br/>
-        <w:t>- Active: "The striker kicked the ball." Here, the striker (subject) is doing the kicking (verb), and the ball is receiving the action.</w:t>
-        <w:br/>
-        <w:br/>
-        <w:t>- Passive: "The ball was kicked by the striker." Now, the ball (subject) is receiving the action, and the striker comes after "by."</w:t>
-        <w:br/>
-        <w:br/>
-        <w:t>This change often shifts the focus of the sentence—from the doer in active voice to the receiver in passive voice.</w:t>
+        <w:t>Think about a football game. If you say, “The striker scored the goal,” that’s active voice. The striker is doing the action. But if you say, “The goal was scored by the striker,” that’s passive—the goal (the thing that matters most now) is getting the action done to it.</w:t>
         <w:br/>
         <w:br/>
         <w:t>### 🤔 Pause and Think</w:t>
         <w:br/>
         <w:br/>
-        <w:t>If you had to rewrite "The students completed the assignment" in passive voice, what would you do first?</w:t>
+        <w:t>If someone says, “The ball was kicked by the player,” who is doing the action?</w:t>
         <w:br/>
         <w:br/>
-        <w:t>### ✅ Continue Teaching</w:t>
+        <w:t>---</w:t>
         <w:br/>
         <w:br/>
-        <w:t>If you thought, "Make the object 'the assignment' the new subject," you’re right! So the passive sentence becomes "The assignment was completed by the students."</w:t>
+        <w:t>### ✅ Now, about that question:</w:t>
         <w:br/>
         <w:br/>
-        <w:t>Here’s the clue: In passive voice, the original object moves to the front, you add a form of "be" (like is, was, were), and then the past participle of the verb (like completed, explained).</w:t>
+        <w:t>The **player** is the one doing the action. The sentence is passive because it focuses on the ball receiving the kick.</w:t>
         <w:br/>
         <w:br/>
-        <w:t>### 💡 One Worked Example</w:t>
+        <w:t>### 💡 Step-by-Step Example: Converting Active to Passive</w:t>
         <w:br/>
         <w:br/>
-        <w:t>Let’s take "The police arrested the suspect."</w:t>
+        <w:t>Active: The students wrote the exam.</w:t>
         <w:br/>
         <w:br/>
-        <w:t>1. Identify the subject, verb, and object:</w:t>
+        <w:t>Let’s change it to passive.</w:t>
         <w:br/>
         <w:br/>
-        <w:t xml:space="preserve">- Subject: The police  </w:t>
-        <w:br/>
-        <w:t xml:space="preserve">- Verb: arrested  </w:t>
-        <w:br/>
-        <w:t xml:space="preserve">- Object: the suspect  </w:t>
+        <w:t>Step 1: Move the object (the exam) to the front: The exam...</w:t>
         <w:br/>
         <w:br/>
-        <w:t>2. Passive voice steps:</w:t>
+        <w:t>Step 2: Add a form of "be." Since "wrote" is past tense, use "was" (past form of "be"): The exam was...</w:t>
         <w:br/>
         <w:br/>
-        <w:t xml:space="preserve">- Move the object "the suspect" to subject position: The suspect  </w:t>
-        <w:br/>
-        <w:t xml:space="preserve">- Add the right form of "be" depending on tense; here, past simple → was  </w:t>
-        <w:br/>
-        <w:t xml:space="preserve">- Use the past participle of "arrest" → arrested  </w:t>
-        <w:br/>
-        <w:t xml:space="preserve">- Add "by" + original subject → by the police  </w:t>
+        <w:t>Step 3: Use the past participle of "write," which is "written": The exam was written...</w:t>
         <w:br/>
         <w:br/>
-        <w:t>**Passive sentence:** The suspect was arrested by the police.</w:t>
+        <w:t>Step 4: Add “by” and the doer at the end: The exam was written by the students.</w:t>
         <w:br/>
         <w:br/>
-        <w:t>### ⚠ Where Students Usually Get Stuck</w:t>
+        <w:t>Now, the exam is the subject receiving the action, and the students come after “by” as the doers.</w:t>
         <w:br/>
         <w:br/>
-        <w:t>A big mistake is forgetting to change the verb to the past participle or forgetting the correct form of "be". Remember, the verb in passive voice isn’t just the normal past tense; it’s the past participle (like "written" not "wrote"). Another trick is to carefully identify the original object to become the new subject.</w:t>
+        <w:t>### ⚠ Watch Out for This</w:t>
+        <w:br/>
+        <w:br/>
+        <w:t>A common mistake is forgetting to change the verb to the past participle after adding the form of “be.” For example, saying "The exam was wrote by the students" is wrong because "wrote" isn’t the past participle—it should be "written." A trick? Remember: after "be," always use the past participle, not the simple past.</w:t>
         <w:br/>
         <w:br/>
         <w:t>### 🎯 Your Turn</w:t>
         <w:br/>
         <w:br/>
-        <w:t>Try changing this active sentence to passive voice: "The artist painted the picture."</w:t>
+        <w:t>Try changing this active sentence into passive:</w:t>
         <w:br/>
         <w:br/>
-        <w:t>Think first about the object and the verb form before writing it down!</w:t>
+        <w:t>“The chef prepared the meal.”</w:t>
+        <w:br/>
+        <w:br/>
+        <w:t>Think about the steps: move the object forward, add the right form of "be," and use the past participle of “prepare.”</w:t>
         <w:br/>
         <w:br/>
         <w:t>---</w:t>
         <w:br/>
         <w:br/>
-        <w:t>Once you get comfortable switching between active and passive, you’ll find that your writing gets clearer and more flexible. Keep practicing, and soon it will feel natural!</w:t>
+        <w:t>Once you’re confident with that, try spotting whether these sentences are active or passive:</w:t>
+        <w:br/>
+        <w:br/>
+        <w:t>1. The teacher praised the student.</w:t>
+        <w:br/>
+        <w:br/>
+        <w:t>2. The painting was created by the artist.</w:t>
+        <w:br/>
+        <w:br/>
+        <w:t>Understanding this will really help with writing clearer and more varied sentences. Let me know how it goes!</w:t>
       </w:r>
     </w:p>
     <w:p>

</xml_diff>